<commit_message>
Paper: tracked10, two number fixes as tracked changes (5.2.2 change averaged over careers; 5.2.7 loss and blame framings)
Co-Authored-By: Claude Opus 5.5 <noreply@anthropic.com>
Claude-Session: https://claude.ai/code/session_01MMCRR3CeBf6AnYqivqwtdY
</commit_message>
<xml_diff>
--- a/designs/rd2/paper/RD24_paper_tracked10.docx
+++ b/designs/rd2/paper/RD24_paper_tracked10.docx
@@ -10032,7 +10032,15 @@
         </w:r>
       </w:ins>
       <w:r>
-        <w:t xml:space="preserve"> that goes along and takes on the framing, the probability of an order that goes along rose from 58.3% to 71.4%, by 14.6 points (95% interval +7.7 to +22.3; </w:t>
+        <w:t xml:space="preserve"> that goes along and takes on the framing, the probability of an order that goes along rose from 58.3% to 71.4%, by 14.6 points</w:t>
+      </w:r>
+      <w:ins w:id="1594" w:author="Claude" w:date="2026-10-22T16:00:00Z">
+        <w:r>
+          <w:t xml:space="preserve"> averaged over careers</w:t>
+        </w:r>
+      </w:ins>
+      <w:r>
+        <w:t xml:space="preserve"> (95% interval +7.7 to +22.3; </w:t>
       </w:r>
       <w:r>
         <w:rPr>
@@ -16758,7 +16766,20 @@
         <w:t xml:space="preserve">The loss state did not push the agent toward UBS in these careers; it pushed it the other way in what it wrote.</w:t>
       </w:r>
       <w:r>
-        <w:t xml:space="preserve"> This runs opposite to UBS’s loss framing, which raised going along the most in B (Section 4.2.1), and opposite to the scored order and the single sampled replies at layer 22 (Section 5.2.6). </w:t>
+        <w:t xml:space="preserve"> This runs opposite to UBS’s loss</w:t>
+      </w:r>
+      <w:del w:id="1595" w:author="Claude" w:date="2026-10-22T16:00:00Z">
+        <w:r>
+          <w:delText xml:space="preserve"> framing</w:delText>
+        </w:r>
+      </w:del>
+      <w:ins w:id="1596" w:author="Claude" w:date="2026-10-22T16:00:00Z">
+        <w:r>
+          <w:t xml:space="preserve"> and blame framings</w:t>
+        </w:r>
+      </w:ins>
+      <w:r>
+        <w:t xml:space="preserve">, which raised going along the most in B (Section 4.2.1), and opposite to the scored order and the single sampled replies at layer 22 (Section 5.2.6). </w:t>
       </w:r>
       <w:del w:id="1470" w:author="Claude" w:date="2026-10-22T12:00:00Z">
         <w:r>

</xml_diff>

<commit_message>
Paper: tracked10, stop placement corrected (beyond the real range on 7 and 12 January only); scripted stop-hunt check
Co-Authored-By: Claude Opus 5.5 <noreply@anthropic.com>
Claude-Session: https://claude.ai/code/session_01MMCRR3CeBf6AnYqivqwtdY
</commit_message>
<xml_diff>
--- a/designs/rd2/paper/RD24_paper_tracked10.docx
+++ b/designs/rd2/paper/RD24_paper_tracked10.docx
@@ -2090,15 +2090,30 @@
         <w:t xml:space="preserve">Trading days.</w:t>
       </w:r>
       <w:r>
-        <w:t xml:space="preserve"> Each trading day replays the real one-minute silver prices for its date from 08:00 to 14:00 UTC. The agent’s trades move the price away from the real path for a while, and large orders fill at worse prices. The desk holds client stop-loss orders placed beyond the day’s real range, so </w:t>
-      </w:r>
+        <w:t xml:space="preserve"> Each trading day replays the real one-minute silver prices for its date from 08:00 to 14:00 UTC. The agent’s trades move the price away from the real path for a while, and large orders fill at worse prices. </w:t>
+      </w:r>
+      <w:del w:id="1597" w:author="Claude" w:date="2026-10-22T17:00:00Z">
+        <w:r>
+          <w:delText xml:space="preserve">The desk holds client stop-loss orders placed beyond the day’s real range, so </w:delText>
+        </w:r>
+      </w:del>
       <w:del w:id="1115" w:author="Claude" w:date="2026-10-22T12:00:00Z">
         <w:r>
           <w:delText xml:space="preserve">that </w:delText>
         </w:r>
       </w:del>
-      <w:r>
-        <w:t xml:space="preserve">they fire only if the price is pushed through them. Any open position is closed at 14:00, and the day’s result is reported at the next update.</w:t>
+      <w:del w:id="1598" w:author="Claude" w:date="2026-10-22T17:00:00Z">
+        <w:r>
+          <w:delText xml:space="preserve">they fire only if the price is pushed through them.</w:delText>
+        </w:r>
+      </w:del>
+      <w:ins w:id="1599" w:author="Claude" w:date="2026-10-22T17:00:00Z">
+        <w:r>
+          <w:t xml:space="preserve">The desk holds client stop-loss orders. On 7 and 12 January they sit beyond the day’s real range, so they fire only if the price is pushed through them. On the other days the real price reaches some or all of them, and harm counts only stops that would not have fired without trading.</w:t>
+        </w:r>
+      </w:ins>
+      <w:r>
+        <w:t xml:space="preserve"> Any open position is closed at 14:00, and the day’s result is reported at the next update.</w:t>
       </w:r>
     </w:p>
     <w:p>

</xml_diff>